<commit_message>
Modification page À propos
</commit_message>
<xml_diff>
--- a/remise3.docx
+++ b/remise3.docx
@@ -2220,7 +2220,7 @@
         <w:rPr>
           <w:lang w:val="fr-FR" w:eastAsia="en-US"/>
         </w:rPr>
-        <w:t xml:space="preserve"> avec Node.js</w:t>
+        <w:t xml:space="preserve"> </w:t>
       </w:r>
     </w:p>
     <w:p>
@@ -2720,21 +2720,7 @@
         <w:rPr>
           <w:lang w:eastAsia="en-US"/>
         </w:rPr>
-        <w:t xml:space="preserve"> 18 s’intègre facilement avec de nombreux outils et environnements modernes. Il fonctionne bien avec des backends comme Node.js, </w:t>
-      </w:r>
-      <w:proofErr w:type="spellStart"/>
-      <w:r>
-        <w:rPr>
-          <w:lang w:eastAsia="en-US"/>
-        </w:rPr>
-        <w:t>Laravel</w:t>
-      </w:r>
-      <w:proofErr w:type="spellEnd"/>
-      <w:r>
-        <w:rPr>
-          <w:lang w:eastAsia="en-US"/>
-        </w:rPr>
-        <w:t xml:space="preserve"> ou </w:t>
+        <w:t xml:space="preserve"> 18 s’intègre facilement avec de nombreux outils et environnements modernes. Il fonctionne bien avec des backends comme Node.js, Laravel ou </w:t>
       </w:r>
       <w:proofErr w:type="spellStart"/>
       <w:r>
@@ -2997,123 +2983,93 @@
         <w:rPr>
           <w:lang w:eastAsia="en-US"/>
         </w:rPr>
-        <w:t xml:space="preserve"> (</w:t>
+        <w:t xml:space="preserve"> (Laravel) du </w:t>
       </w:r>
       <w:proofErr w:type="spellStart"/>
       <w:r>
         <w:rPr>
           <w:lang w:eastAsia="en-US"/>
         </w:rPr>
-        <w:t>Laravel</w:t>
+        <w:t>front-end</w:t>
       </w:r>
       <w:proofErr w:type="spellEnd"/>
       <w:r>
         <w:rPr>
           <w:lang w:eastAsia="en-US"/>
         </w:rPr>
-        <w:t xml:space="preserve">) du </w:t>
+        <w:t>.</w:t>
+      </w:r>
+    </w:p>
+    <w:p>
+      <w:pPr>
+        <w:rPr>
+          <w:lang w:eastAsia="en-US"/>
+        </w:rPr>
+      </w:pPr>
+      <w:r>
+        <w:rPr>
+          <w:lang w:eastAsia="en-US"/>
+        </w:rPr>
+        <w:t>Laravel offre des fonctionnalités robustes pour créer des API, un système de routage flexible, un ORM pour interagir avec les bases de données, des outils de validation, un système d'authentification et d'autorisation</w:t>
+      </w:r>
+      <w:r>
+        <w:rPr>
+          <w:lang w:eastAsia="en-US"/>
+        </w:rPr>
+        <w:t>, et</w:t>
+      </w:r>
+      <w:r>
+        <w:rPr>
+          <w:lang w:eastAsia="en-US"/>
+        </w:rPr>
+        <w:t xml:space="preserve"> la gestion de la sérialisation des réponses avec les ressources API. Ces fonctionnalités permettent de construire des API sécurisées, évolutives et maintenables. </w:t>
+      </w:r>
+    </w:p>
+    <w:p>
+      <w:pPr>
+        <w:rPr>
+          <w:lang w:eastAsia="en-US"/>
+        </w:rPr>
+      </w:pPr>
+      <w:r>
+        <w:rPr>
+          <w:lang w:eastAsia="en-US"/>
+        </w:rPr>
+        <w:t>Les meilleures pratiques d’un API Laravel est d’utiliser JSON comme format de réponse, de séparer les routes web et les routes API</w:t>
+      </w:r>
+      <w:r>
+        <w:rPr>
+          <w:lang w:eastAsia="en-US"/>
+        </w:rPr>
+        <w:t>. Il faut aussi gérer les erreurs avec des réponses standardisées (</w:t>
       </w:r>
       <w:proofErr w:type="spellStart"/>
       <w:r>
         <w:rPr>
           <w:lang w:eastAsia="en-US"/>
         </w:rPr>
-        <w:t>front-end</w:t>
+        <w:t>response</w:t>
       </w:r>
       <w:proofErr w:type="spellEnd"/>
       <w:r>
         <w:rPr>
           <w:lang w:eastAsia="en-US"/>
         </w:rPr>
-        <w:t>.</w:t>
-      </w:r>
-    </w:p>
-    <w:p>
-      <w:pPr>
-        <w:rPr>
-          <w:lang w:eastAsia="en-US"/>
-        </w:rPr>
-      </w:pPr>
-      <w:r>
-        <w:rPr>
-          <w:lang w:eastAsia="en-US"/>
-        </w:rPr>
-        <w:t>Laravel offre des fonctionnalités robustes pour créer des API, un système de routage flexible, un ORM pour interagir avec les bases de données, des outils de validation, un système d'authentification et d'autorisation</w:t>
-      </w:r>
-      <w:r>
-        <w:rPr>
-          <w:lang w:eastAsia="en-US"/>
-        </w:rPr>
-        <w:t>, et</w:t>
-      </w:r>
-      <w:r>
-        <w:rPr>
-          <w:lang w:eastAsia="en-US"/>
-        </w:rPr>
-        <w:t xml:space="preserve"> la gestion de la sérialisation des réponses avec les ressources API. Ces fonctionnalités permettent de construire des API sécurisées, évolutives et maintenables. </w:t>
-      </w:r>
-    </w:p>
-    <w:p>
-      <w:pPr>
-        <w:rPr>
-          <w:lang w:eastAsia="en-US"/>
-        </w:rPr>
-      </w:pPr>
-      <w:r>
-        <w:rPr>
-          <w:lang w:eastAsia="en-US"/>
-        </w:rPr>
-        <w:t>Les meilleures pratiques d’un API Laravel est d’utiliser JSON comme format de réponse, de séparer les routes web et les routes API</w:t>
-      </w:r>
-      <w:r>
-        <w:rPr>
-          <w:lang w:eastAsia="en-US"/>
-        </w:rPr>
-        <w:t>. Il faut aussi gérer les erreurs avec des réponses standardisées (</w:t>
+        <w:t>()-&gt;</w:t>
       </w:r>
       <w:proofErr w:type="spellStart"/>
-      <w:proofErr w:type="gramStart"/>
-      <w:r>
-        <w:rPr>
-          <w:lang w:eastAsia="en-US"/>
-        </w:rPr>
-        <w:t>response</w:t>
+      <w:r>
+        <w:rPr>
+          <w:lang w:eastAsia="en-US"/>
+        </w:rPr>
+        <w:t>json</w:t>
       </w:r>
       <w:proofErr w:type="spellEnd"/>
       <w:r>
         <w:rPr>
           <w:lang w:eastAsia="en-US"/>
         </w:rPr>
-        <w:t>(</w:t>
-      </w:r>
-      <w:proofErr w:type="gramEnd"/>
-      <w:r>
-        <w:rPr>
-          <w:lang w:eastAsia="en-US"/>
-        </w:rPr>
-        <w:t>)-&gt;</w:t>
-      </w:r>
-      <w:proofErr w:type="spellStart"/>
-      <w:proofErr w:type="gramStart"/>
-      <w:r>
-        <w:rPr>
-          <w:lang w:eastAsia="en-US"/>
-        </w:rPr>
-        <w:t>json</w:t>
-      </w:r>
-      <w:proofErr w:type="spellEnd"/>
-      <w:r>
-        <w:rPr>
-          <w:lang w:eastAsia="en-US"/>
-        </w:rPr>
-        <w:t>(</w:t>
-      </w:r>
-      <w:proofErr w:type="gramEnd"/>
-      <w:r>
-        <w:rPr>
-          <w:lang w:eastAsia="en-US"/>
-        </w:rPr>
-        <w:t>[...], 400)).</w:t>
+        <w:t>([...], 400)).</w:t>
       </w:r>
       <w:r>
         <w:rPr>

</xml_diff>

<commit_message>
Update remise3.docx et ajout pdf remise
</commit_message>
<xml_diff>
--- a/remise3.docx
+++ b/remise3.docx
@@ -678,7 +678,7 @@
           <w:r>
             <w:fldChar w:fldCharType="separate"/>
           </w:r>
-          <w:hyperlink w:anchor="_Toc216001191" w:history="1">
+          <w:hyperlink w:anchor="_Toc216001499" w:history="1">
             <w:r>
               <w:rPr>
                 <w:rStyle w:val="Lienhypertexte"/>
@@ -706,7 +706,7 @@
                 <w:noProof/>
                 <w:webHidden/>
               </w:rPr>
-              <w:instrText xml:space="preserve"> PAGEREF _Toc216001191 \h </w:instrText>
+              <w:instrText xml:space="preserve"> PAGEREF _Toc216001499 \h </w:instrText>
             </w:r>
             <w:r>
               <w:rPr>
@@ -751,7 +751,7 @@
               <w14:ligatures w14:val="standardContextual"/>
             </w:rPr>
           </w:pPr>
-          <w:hyperlink w:anchor="_Toc216001192" w:history="1">
+          <w:hyperlink w:anchor="_Toc216001500" w:history="1">
             <w:r>
               <w:rPr>
                 <w:rStyle w:val="Lienhypertexte"/>
@@ -779,7 +779,7 @@
                 <w:noProof/>
                 <w:webHidden/>
               </w:rPr>
-              <w:instrText xml:space="preserve"> PAGEREF _Toc216001192 \h </w:instrText>
+              <w:instrText xml:space="preserve"> PAGEREF _Toc216001500 \h </w:instrText>
             </w:r>
             <w:r>
               <w:rPr>
@@ -824,7 +824,7 @@
               <w14:ligatures w14:val="standardContextual"/>
             </w:rPr>
           </w:pPr>
-          <w:hyperlink w:anchor="_Toc216001193" w:history="1">
+          <w:hyperlink w:anchor="_Toc216001501" w:history="1">
             <w:r>
               <w:rPr>
                 <w:rStyle w:val="Lienhypertexte"/>
@@ -852,7 +852,7 @@
                 <w:noProof/>
                 <w:webHidden/>
               </w:rPr>
-              <w:instrText xml:space="preserve"> PAGEREF _Toc216001193 \h </w:instrText>
+              <w:instrText xml:space="preserve"> PAGEREF _Toc216001501 \h </w:instrText>
             </w:r>
             <w:r>
               <w:rPr>
@@ -897,7 +897,7 @@
               <w14:ligatures w14:val="standardContextual"/>
             </w:rPr>
           </w:pPr>
-          <w:hyperlink w:anchor="_Toc216001194" w:history="1">
+          <w:hyperlink w:anchor="_Toc216001502" w:history="1">
             <w:r>
               <w:rPr>
                 <w:rStyle w:val="Lienhypertexte"/>
@@ -925,7 +925,7 @@
                 <w:noProof/>
                 <w:webHidden/>
               </w:rPr>
-              <w:instrText xml:space="preserve"> PAGEREF _Toc216001194 \h </w:instrText>
+              <w:instrText xml:space="preserve"> PAGEREF _Toc216001502 \h </w:instrText>
             </w:r>
             <w:r>
               <w:rPr>
@@ -970,7 +970,7 @@
               <w14:ligatures w14:val="standardContextual"/>
             </w:rPr>
           </w:pPr>
-          <w:hyperlink w:anchor="_Toc216001195" w:history="1">
+          <w:hyperlink w:anchor="_Toc216001503" w:history="1">
             <w:r>
               <w:rPr>
                 <w:rStyle w:val="Lienhypertexte"/>
@@ -998,7 +998,7 @@
                 <w:noProof/>
                 <w:webHidden/>
               </w:rPr>
-              <w:instrText xml:space="preserve"> PAGEREF _Toc216001195 \h </w:instrText>
+              <w:instrText xml:space="preserve"> PAGEREF _Toc216001503 \h </w:instrText>
             </w:r>
             <w:r>
               <w:rPr>
@@ -1043,7 +1043,7 @@
               <w14:ligatures w14:val="standardContextual"/>
             </w:rPr>
           </w:pPr>
-          <w:hyperlink w:anchor="_Toc216001196" w:history="1">
+          <w:hyperlink w:anchor="_Toc216001504" w:history="1">
             <w:r>
               <w:rPr>
                 <w:rStyle w:val="Lienhypertexte"/>
@@ -1071,7 +1071,7 @@
                 <w:noProof/>
                 <w:webHidden/>
               </w:rPr>
-              <w:instrText xml:space="preserve"> PAGEREF _Toc216001196 \h </w:instrText>
+              <w:instrText xml:space="preserve"> PAGEREF _Toc216001504 \h </w:instrText>
             </w:r>
             <w:r>
               <w:rPr>
@@ -1116,7 +1116,7 @@
               <w14:ligatures w14:val="standardContextual"/>
             </w:rPr>
           </w:pPr>
-          <w:hyperlink w:anchor="_Toc216001197" w:history="1">
+          <w:hyperlink w:anchor="_Toc216001505" w:history="1">
             <w:r>
               <w:rPr>
                 <w:rStyle w:val="Lienhypertexte"/>
@@ -1144,7 +1144,7 @@
                 <w:noProof/>
                 <w:webHidden/>
               </w:rPr>
-              <w:instrText xml:space="preserve"> PAGEREF _Toc216001197 \h </w:instrText>
+              <w:instrText xml:space="preserve"> PAGEREF _Toc216001505 \h </w:instrText>
             </w:r>
             <w:r>
               <w:rPr>
@@ -1189,7 +1189,7 @@
               <w14:ligatures w14:val="standardContextual"/>
             </w:rPr>
           </w:pPr>
-          <w:hyperlink w:anchor="_Toc216001198" w:history="1">
+          <w:hyperlink w:anchor="_Toc216001506" w:history="1">
             <w:r>
               <w:rPr>
                 <w:rStyle w:val="Lienhypertexte"/>
@@ -1217,7 +1217,7 @@
                 <w:noProof/>
                 <w:webHidden/>
               </w:rPr>
-              <w:instrText xml:space="preserve"> PAGEREF _Toc216001198 \h </w:instrText>
+              <w:instrText xml:space="preserve"> PAGEREF _Toc216001506 \h </w:instrText>
             </w:r>
             <w:r>
               <w:rPr>
@@ -1262,7 +1262,7 @@
               <w14:ligatures w14:val="standardContextual"/>
             </w:rPr>
           </w:pPr>
-          <w:hyperlink w:anchor="_Toc216001199" w:history="1">
+          <w:hyperlink w:anchor="_Toc216001507" w:history="1">
             <w:r>
               <w:rPr>
                 <w:rStyle w:val="Lienhypertexte"/>
@@ -1290,7 +1290,7 @@
                 <w:noProof/>
                 <w:webHidden/>
               </w:rPr>
-              <w:instrText xml:space="preserve"> PAGEREF _Toc216001199 \h </w:instrText>
+              <w:instrText xml:space="preserve"> PAGEREF _Toc216001507 \h </w:instrText>
             </w:r>
             <w:r>
               <w:rPr>
@@ -1335,7 +1335,7 @@
               <w14:ligatures w14:val="standardContextual"/>
             </w:rPr>
           </w:pPr>
-          <w:hyperlink w:anchor="_Toc216001200" w:history="1">
+          <w:hyperlink w:anchor="_Toc216001508" w:history="1">
             <w:r>
               <w:rPr>
                 <w:rStyle w:val="Lienhypertexte"/>
@@ -1363,7 +1363,7 @@
                 <w:noProof/>
                 <w:webHidden/>
               </w:rPr>
-              <w:instrText xml:space="preserve"> PAGEREF _Toc216001200 \h </w:instrText>
+              <w:instrText xml:space="preserve"> PAGEREF _Toc216001508 \h </w:instrText>
             </w:r>
             <w:r>
               <w:rPr>
@@ -1408,7 +1408,7 @@
               <w14:ligatures w14:val="standardContextual"/>
             </w:rPr>
           </w:pPr>
-          <w:hyperlink w:anchor="_Toc216001201" w:history="1">
+          <w:hyperlink w:anchor="_Toc216001509" w:history="1">
             <w:r>
               <w:rPr>
                 <w:rStyle w:val="Lienhypertexte"/>
@@ -1436,7 +1436,7 @@
                 <w:noProof/>
                 <w:webHidden/>
               </w:rPr>
-              <w:instrText xml:space="preserve"> PAGEREF _Toc216001201 \h </w:instrText>
+              <w:instrText xml:space="preserve"> PAGEREF _Toc216001509 \h </w:instrText>
             </w:r>
             <w:r>
               <w:rPr>
@@ -1481,7 +1481,7 @@
               <w14:ligatures w14:val="standardContextual"/>
             </w:rPr>
           </w:pPr>
-          <w:hyperlink w:anchor="_Toc216001202" w:history="1">
+          <w:hyperlink w:anchor="_Toc216001510" w:history="1">
             <w:r>
               <w:rPr>
                 <w:rStyle w:val="Lienhypertexte"/>
@@ -1508,7 +1508,7 @@
                 <w:noProof/>
                 <w:webHidden/>
               </w:rPr>
-              <w:instrText xml:space="preserve"> PAGEREF _Toc216001202 \h </w:instrText>
+              <w:instrText xml:space="preserve"> PAGEREF _Toc216001510 \h </w:instrText>
             </w:r>
             <w:r>
               <w:rPr>
@@ -1553,7 +1553,7 @@
               <w14:ligatures w14:val="standardContextual"/>
             </w:rPr>
           </w:pPr>
-          <w:hyperlink w:anchor="_Toc216001203" w:history="1">
+          <w:hyperlink w:anchor="_Toc216001511" w:history="1">
             <w:r>
               <w:rPr>
                 <w:rStyle w:val="Lienhypertexte"/>
@@ -1581,7 +1581,7 @@
                 <w:noProof/>
                 <w:webHidden/>
               </w:rPr>
-              <w:instrText xml:space="preserve"> PAGEREF _Toc216001203 \h </w:instrText>
+              <w:instrText xml:space="preserve"> PAGEREF _Toc216001511 \h </w:instrText>
             </w:r>
             <w:r>
               <w:rPr>
@@ -1626,7 +1626,7 @@
               <w14:ligatures w14:val="standardContextual"/>
             </w:rPr>
           </w:pPr>
-          <w:hyperlink w:anchor="_Toc216001204" w:history="1">
+          <w:hyperlink w:anchor="_Toc216001512" w:history="1">
             <w:r>
               <w:rPr>
                 <w:rStyle w:val="Lienhypertexte"/>
@@ -1654,7 +1654,79 @@
                 <w:noProof/>
                 <w:webHidden/>
               </w:rPr>
-              <w:instrText xml:space="preserve"> PAGEREF _Toc216001204 \h </w:instrText>
+              <w:instrText xml:space="preserve"> PAGEREF _Toc216001512 \h </w:instrText>
+            </w:r>
+            <w:r>
+              <w:rPr>
+                <w:noProof/>
+                <w:webHidden/>
+              </w:rPr>
+            </w:r>
+            <w:r>
+              <w:rPr>
+                <w:noProof/>
+                <w:webHidden/>
+              </w:rPr>
+              <w:fldChar w:fldCharType="separate"/>
+            </w:r>
+            <w:r>
+              <w:rPr>
+                <w:noProof/>
+                <w:webHidden/>
+              </w:rPr>
+              <w:t>7</w:t>
+            </w:r>
+            <w:r>
+              <w:rPr>
+                <w:noProof/>
+                <w:webHidden/>
+              </w:rPr>
+              <w:fldChar w:fldCharType="end"/>
+            </w:r>
+          </w:hyperlink>
+        </w:p>
+        <w:p>
+          <w:pPr>
+            <w:pStyle w:val="TM3"/>
+            <w:tabs>
+              <w:tab w:val="right" w:leader="dot" w:pos="9622"/>
+            </w:tabs>
+            <w:rPr>
+              <w:noProof/>
+              <w:kern w:val="2"/>
+              <w:sz w:val="24"/>
+              <w:szCs w:val="24"/>
+              <w14:ligatures w14:val="standardContextual"/>
+            </w:rPr>
+          </w:pPr>
+          <w:hyperlink w:anchor="_Toc216001513" w:history="1">
+            <w:r>
+              <w:rPr>
+                <w:rStyle w:val="Lienhypertexte"/>
+                <w:noProof/>
+              </w:rPr>
+              <w:t>AIs utilisés</w:t>
+            </w:r>
+            <w:r>
+              <w:rPr>
+                <w:noProof/>
+                <w:webHidden/>
+              </w:rPr>
+              <w:tab/>
+            </w:r>
+            <w:r>
+              <w:rPr>
+                <w:noProof/>
+                <w:webHidden/>
+              </w:rPr>
+              <w:fldChar w:fldCharType="begin"/>
+            </w:r>
+            <w:r>
+              <w:rPr>
+                <w:noProof/>
+                <w:webHidden/>
+              </w:rPr>
+              <w:instrText xml:space="preserve"> PAGEREF _Toc216001513 \h </w:instrText>
             </w:r>
             <w:r>
               <w:rPr>
@@ -1699,7 +1771,7 @@
               <w14:ligatures w14:val="standardContextual"/>
             </w:rPr>
           </w:pPr>
-          <w:hyperlink w:anchor="_Toc216001205" w:history="1">
+          <w:hyperlink w:anchor="_Toc216001514" w:history="1">
             <w:r>
               <w:rPr>
                 <w:rStyle w:val="Lienhypertexte"/>
@@ -1727,7 +1799,7 @@
                 <w:noProof/>
                 <w:webHidden/>
               </w:rPr>
-              <w:instrText xml:space="preserve"> PAGEREF _Toc216001205 \h </w:instrText>
+              <w:instrText xml:space="preserve"> PAGEREF _Toc216001514 \h </w:instrText>
             </w:r>
             <w:r>
               <w:rPr>
@@ -1772,7 +1844,7 @@
               <w14:ligatures w14:val="standardContextual"/>
             </w:rPr>
           </w:pPr>
-          <w:hyperlink w:anchor="_Toc216001206" w:history="1">
+          <w:hyperlink w:anchor="_Toc216001515" w:history="1">
             <w:r>
               <w:rPr>
                 <w:rStyle w:val="Lienhypertexte"/>
@@ -1800,7 +1872,7 @@
                 <w:noProof/>
                 <w:webHidden/>
               </w:rPr>
-              <w:instrText xml:space="preserve"> PAGEREF _Toc216001206 \h </w:instrText>
+              <w:instrText xml:space="preserve"> PAGEREF _Toc216001515 \h </w:instrText>
             </w:r>
             <w:r>
               <w:rPr>
@@ -1845,7 +1917,7 @@
               <w14:ligatures w14:val="standardContextual"/>
             </w:rPr>
           </w:pPr>
-          <w:hyperlink w:anchor="_Toc216001207" w:history="1">
+          <w:hyperlink w:anchor="_Toc216001516" w:history="1">
             <w:r>
               <w:rPr>
                 <w:rStyle w:val="Lienhypertexte"/>
@@ -1873,7 +1945,7 @@
                 <w:noProof/>
                 <w:webHidden/>
               </w:rPr>
-              <w:instrText xml:space="preserve"> PAGEREF _Toc216001207 \h </w:instrText>
+              <w:instrText xml:space="preserve"> PAGEREF _Toc216001516 \h </w:instrText>
             </w:r>
             <w:r>
               <w:rPr>
@@ -1893,7 +1965,7 @@
                 <w:noProof/>
                 <w:webHidden/>
               </w:rPr>
-              <w:t>7</w:t>
+              <w:t>8</w:t>
             </w:r>
             <w:r>
               <w:rPr>
@@ -1943,7 +2015,7 @@
           <w:lang w:val="fr-FR" w:eastAsia="en-US"/>
         </w:rPr>
       </w:pPr>
-      <w:bookmarkStart w:id="0" w:name="_Toc216001191"/>
+      <w:bookmarkStart w:id="0" w:name="_Toc216001499"/>
       <w:r>
         <w:rPr>
           <w:lang w:val="fr-FR" w:eastAsia="en-US"/>
@@ -1966,7 +2038,7 @@
           <w:lang w:val="fr-FR" w:eastAsia="en-US"/>
         </w:rPr>
       </w:pPr>
-      <w:bookmarkStart w:id="1" w:name="_Toc216001192"/>
+      <w:bookmarkStart w:id="1" w:name="_Toc216001500"/>
       <w:r>
         <w:rPr>
           <w:lang w:val="fr-FR" w:eastAsia="en-US"/>
@@ -1982,7 +2054,7 @@
           <w:lang w:val="fr-FR" w:eastAsia="en-US"/>
         </w:rPr>
       </w:pPr>
-      <w:bookmarkStart w:id="2" w:name="_Toc216001193"/>
+      <w:bookmarkStart w:id="2" w:name="_Toc216001501"/>
       <w:r>
         <w:rPr>
           <w:lang w:val="fr-FR" w:eastAsia="en-US"/>
@@ -2017,7 +2089,7 @@
           <w:lang w:val="fr-FR" w:eastAsia="en-US"/>
         </w:rPr>
       </w:pPr>
-      <w:bookmarkStart w:id="3" w:name="_Toc216001194"/>
+      <w:bookmarkStart w:id="3" w:name="_Toc216001502"/>
       <w:r>
         <w:rPr>
           <w:lang w:val="fr-FR" w:eastAsia="en-US"/>
@@ -2038,19 +2110,11 @@
           <w:lang w:val="fr-FR" w:eastAsia="en-US"/>
         </w:rPr>
       </w:pPr>
-      <w:proofErr w:type="spellStart"/>
-      <w:r>
-        <w:rPr>
-          <w:lang w:val="fr-FR" w:eastAsia="en-US"/>
-        </w:rPr>
-        <w:t>Angular</w:t>
-      </w:r>
-      <w:proofErr w:type="spellEnd"/>
-      <w:r>
-        <w:rPr>
-          <w:lang w:val="fr-FR" w:eastAsia="en-US"/>
-        </w:rPr>
-        <w:t xml:space="preserve"> 18</w:t>
+      <w:r>
+        <w:rPr>
+          <w:lang w:val="fr-FR" w:eastAsia="en-US"/>
+        </w:rPr>
+        <w:t>Angular 18</w:t>
       </w:r>
       <w:r>
         <w:rPr>
@@ -2084,7 +2148,7 @@
           <w:lang w:val="fr-FR" w:eastAsia="en-US"/>
         </w:rPr>
       </w:pPr>
-      <w:bookmarkStart w:id="4" w:name="_Toc216001195"/>
+      <w:bookmarkStart w:id="4" w:name="_Toc216001503"/>
       <w:r>
         <w:rPr>
           <w:lang w:val="fr-FR" w:eastAsia="en-US"/>
@@ -2217,37 +2281,7 @@
         <w:rPr>
           <w:lang w:eastAsia="en-US"/>
         </w:rPr>
-        <w:t xml:space="preserve">Semaine </w:t>
-      </w:r>
-      <w:r>
-        <w:rPr>
-          <w:lang w:eastAsia="en-US"/>
-        </w:rPr>
-        <w:t>4</w:t>
-      </w:r>
-      <w:r>
-        <w:rPr>
-          <w:lang w:eastAsia="en-US"/>
-        </w:rPr>
-        <w:t xml:space="preserve"> : </w:t>
-      </w:r>
-      <w:r>
-        <w:rPr>
-          <w:lang w:eastAsia="en-US"/>
-        </w:rPr>
-        <w:t>D</w:t>
-      </w:r>
-      <w:r>
-        <w:rPr>
-          <w:lang w:eastAsia="en-US"/>
-        </w:rPr>
-        <w:t>émonstration</w:t>
-      </w:r>
-      <w:r>
-        <w:rPr>
-          <w:lang w:eastAsia="en-US"/>
-        </w:rPr>
-        <w:t xml:space="preserve"> </w:t>
+        <w:t xml:space="preserve">Semaine 4 : Démonstration </w:t>
       </w:r>
       <w:r>
         <w:rPr>
@@ -2263,7 +2297,7 @@
           <w:lang w:eastAsia="en-US"/>
         </w:rPr>
       </w:pPr>
-      <w:bookmarkStart w:id="5" w:name="_Toc216001196"/>
+      <w:bookmarkStart w:id="5" w:name="_Toc216001504"/>
       <w:r>
         <w:rPr>
           <w:lang w:eastAsia="en-US"/>
@@ -2286,7 +2320,7 @@
           <w:lang w:val="fr-FR" w:eastAsia="en-US"/>
         </w:rPr>
       </w:pPr>
-      <w:bookmarkStart w:id="6" w:name="_Toc216001197"/>
+      <w:bookmarkStart w:id="6" w:name="_Toc216001505"/>
       <w:r>
         <w:rPr>
           <w:lang w:val="fr-FR" w:eastAsia="en-US"/>
@@ -2302,7 +2336,7 @@
           <w:lang w:eastAsia="en-US"/>
         </w:rPr>
       </w:pPr>
-      <w:bookmarkStart w:id="7" w:name="_Toc216001198"/>
+      <w:bookmarkStart w:id="7" w:name="_Toc216001506"/>
       <w:r>
         <w:rPr>
           <w:lang w:eastAsia="en-US"/>
@@ -2494,7 +2528,7 @@
           <w:lang w:val="fr-FR" w:eastAsia="en-US"/>
         </w:rPr>
       </w:pPr>
-      <w:bookmarkStart w:id="8" w:name="_Toc216001199"/>
+      <w:bookmarkStart w:id="8" w:name="_Toc216001507"/>
       <w:r>
         <w:rPr>
           <w:lang w:val="fr-FR" w:eastAsia="en-US"/>
@@ -2604,7 +2638,7 @@
           <w:lang w:val="fr-FR" w:eastAsia="en-US"/>
         </w:rPr>
       </w:pPr>
-      <w:bookmarkStart w:id="9" w:name="_Toc216001200"/>
+      <w:bookmarkStart w:id="9" w:name="_Toc216001508"/>
       <w:r>
         <w:rPr>
           <w:lang w:val="fr-FR" w:eastAsia="en-US"/>
@@ -2823,7 +2857,7 @@
           <w:lang w:val="fr-FR" w:eastAsia="en-US"/>
         </w:rPr>
       </w:pPr>
-      <w:bookmarkStart w:id="10" w:name="_Toc216001201"/>
+      <w:bookmarkStart w:id="10" w:name="_Toc216001509"/>
       <w:r>
         <w:rPr>
           <w:lang w:val="fr-FR" w:eastAsia="en-US"/>
@@ -2986,7 +3020,7 @@
           <w:lang w:val="fr-FR" w:eastAsia="en-US"/>
         </w:rPr>
       </w:pPr>
-      <w:bookmarkStart w:id="11" w:name="_Toc216001202"/>
+      <w:bookmarkStart w:id="11" w:name="_Toc216001510"/>
       <w:r>
         <w:t>Clarifications</w:t>
       </w:r>
@@ -3414,7 +3448,7 @@
           <w:lang w:eastAsia="en-US"/>
         </w:rPr>
       </w:pPr>
-      <w:bookmarkStart w:id="12" w:name="_Toc216001203"/>
+      <w:bookmarkStart w:id="12" w:name="_Toc216001511"/>
       <w:r>
         <w:rPr>
           <w:lang w:eastAsia="en-US"/>
@@ -3589,7 +3623,7 @@
           <w:lang w:val="fr-FR" w:eastAsia="en-US"/>
         </w:rPr>
       </w:pPr>
-      <w:bookmarkStart w:id="13" w:name="_Toc216001204"/>
+      <w:bookmarkStart w:id="13" w:name="_Toc216001512"/>
       <w:r>
         <w:rPr>
           <w:lang w:val="fr-FR" w:eastAsia="en-US"/>
@@ -3613,19 +3647,58 @@
     </w:p>
     <w:p>
       <w:pPr>
+        <w:rPr>
+          <w:lang w:val="fr-FR" w:eastAsia="en-US"/>
+        </w:rPr>
+      </w:pPr>
+      <w:bookmarkStart w:id="14" w:name="_Toc216001513"/>
+      <w:r>
+        <w:rPr>
+          <w:rStyle w:val="Titre3Car"/>
+        </w:rPr>
+        <w:t>AI</w:t>
+      </w:r>
+      <w:r>
+        <w:rPr>
+          <w:rStyle w:val="Titre3Car"/>
+        </w:rPr>
+        <w:t>s</w:t>
+      </w:r>
+      <w:r>
+        <w:rPr>
+          <w:rStyle w:val="Titre3Car"/>
+        </w:rPr>
+        <w:t xml:space="preserve"> utilisé</w:t>
+      </w:r>
+      <w:r>
+        <w:rPr>
+          <w:rStyle w:val="Titre3Car"/>
+        </w:rPr>
+        <w:t>s</w:t>
+      </w:r>
+      <w:bookmarkEnd w:id="14"/>
+      <w:r>
+        <w:rPr>
+          <w:lang w:val="fr-FR" w:eastAsia="en-US"/>
+        </w:rPr>
+        <w:t> :  Chat GPT, Claude et Copilot.</w:t>
+      </w:r>
+    </w:p>
+    <w:p>
+      <w:pPr>
         <w:pStyle w:val="Titre2"/>
         <w:rPr>
           <w:lang w:val="fr-FR" w:eastAsia="en-US"/>
         </w:rPr>
       </w:pPr>
-      <w:bookmarkStart w:id="14" w:name="_Toc216001205"/>
+      <w:bookmarkStart w:id="15" w:name="_Toc216001514"/>
       <w:r>
         <w:rPr>
           <w:lang w:val="fr-FR" w:eastAsia="en-US"/>
         </w:rPr>
         <w:t>Réflexions critique</w:t>
       </w:r>
-      <w:bookmarkEnd w:id="14"/>
+      <w:bookmarkEnd w:id="15"/>
       <w:r>
         <w:rPr>
           <w:lang w:val="fr-FR" w:eastAsia="en-US"/>
@@ -3640,14 +3713,14 @@
           <w:lang w:val="fr-FR" w:eastAsia="en-US"/>
         </w:rPr>
       </w:pPr>
-      <w:bookmarkStart w:id="15" w:name="_Toc216001206"/>
+      <w:bookmarkStart w:id="16" w:name="_Toc216001515"/>
       <w:r>
         <w:rPr>
           <w:lang w:val="fr-FR" w:eastAsia="en-US"/>
         </w:rPr>
         <w:t>Sur les limites de la technologie</w:t>
       </w:r>
-      <w:bookmarkEnd w:id="15"/>
+      <w:bookmarkEnd w:id="16"/>
       <w:r>
         <w:rPr>
           <w:lang w:val="fr-FR" w:eastAsia="en-US"/>
@@ -3902,14 +3975,15 @@
           <w:lang w:val="fr-FR" w:eastAsia="en-US"/>
         </w:rPr>
       </w:pPr>
-      <w:bookmarkStart w:id="16" w:name="_Toc216001207"/>
-      <w:r>
-        <w:rPr>
-          <w:lang w:val="fr-FR" w:eastAsia="en-US"/>
-        </w:rPr>
+      <w:bookmarkStart w:id="17" w:name="_Toc216001516"/>
+      <w:r>
+        <w:rPr>
+          <w:lang w:val="fr-FR" w:eastAsia="en-US"/>
+        </w:rPr>
+        <w:lastRenderedPageBreak/>
         <w:t>Sur le potentiel de la technologie</w:t>
       </w:r>
-      <w:bookmarkEnd w:id="16"/>
+      <w:bookmarkEnd w:id="17"/>
     </w:p>
     <w:p>
       <w:pPr>
@@ -3972,7 +4046,6 @@
         <w:rPr>
           <w:lang w:val="fr-FR" w:eastAsia="en-US"/>
         </w:rPr>
-        <w:lastRenderedPageBreak/>
         <w:t>Node.js</w:t>
       </w:r>
     </w:p>

</xml_diff>